<commit_message>
📄 DOCX firmado: 45220677000173 - 31/3/2026, 6:54:26 p.m.
</commit_message>
<xml_diff>
--- a/data/declaraciones/signed/45220677000173.docx
+++ b/data/declaraciones/signed/45220677000173.docx
@@ -4262,7 +4262,7 @@
         <w:rPr>
           <w:lang w:val="es-MX"/>
         </w:rPr>
-        <w:t xml:space="preserve">RB MIDIAS SOCIAIS LTDA</w:t>
+        <w:t xml:space="preserve">Roberta Bonkoski Buffara</w:t>
       </w:r>
       <w:proofErr w:type="spellStart"/>
       <w:r>
@@ -4457,7 +4457,7 @@
         <w:rPr>
           <w:lang w:val="es-MX"/>
         </w:rPr>
-        <w:t xml:space="preserve">: 06 de fevereiro de 2026</w:t>
+        <w:t xml:space="preserve">: 31 de março de 2026</w:t>
       </w:r>
       <w:proofErr w:type="spellStart"/>
       <w:r>

</xml_diff>